<commit_message>
Draft reply to John Hart's 7/20 follow-up questions
John is taking the lead on the loan, confirmed the promo program
doesn't apply (deal is under the $1M threshold), and raised three
open items: startup vs. change-of-ownership classification, target
tax returns/valuation, and lease term. New draft addresses all three
directly. Package audit re-verified 40/40.

Co-Authored-By: Claude Fable 5 <noreply@anthropic.com>
Claude-Session: https://claude.ai/code/session_01GAHLyfqLR9bxwN2jm6VjPU
</commit_message>
<xml_diff>
--- a/sba_application/13_checklist_response_2026-07-16/AUDIT REPORT.docx
+++ b/sba_application/13_checklist_response_2026-07-16/AUDIT REPORT.docx
@@ -25,7 +25,7 @@
         <w:rPr>
           <w:b/>
         </w:rPr>
-        <w:t>RESULT: 38 of 38 checks passed.</w:t>
+        <w:t>RESULT: 40 of 40 checks passed.</w:t>
       </w:r>
     </w:p>
     <w:p>
@@ -607,6 +607,59 @@
                 <w:sz w:val="17"/>
               </w:rPr>
               <w:t>1 Checklist STATUS RESPONSE.docx</w:t>
+            </w:r>
+          </w:p>
+        </w:tc>
+        <w:tc>
+          <w:tcPr>
+            <w:tcW w:type="dxa" w:w="2160"/>
+          </w:tcPr>
+          <w:p>
+            <w:r>
+              <w:rPr>
+                <w:sz w:val="17"/>
+              </w:rPr>
+              <w:t>PASS</w:t>
+            </w:r>
+          </w:p>
+        </w:tc>
+        <w:tc>
+          <w:tcPr>
+            <w:tcW w:type="dxa" w:w="2160"/>
+          </w:tcPr>
+          <w:p>
+            <w:r>
+              <w:rPr>
+                <w:sz w:val="17"/>
+              </w:rPr>
+            </w:r>
+          </w:p>
+        </w:tc>
+      </w:tr>
+      <w:tr>
+        <w:tc>
+          <w:tcPr>
+            <w:tcW w:type="dxa" w:w="2160"/>
+          </w:tcPr>
+          <w:p>
+            <w:r>
+              <w:rPr>
+                <w:sz w:val="17"/>
+              </w:rPr>
+              <w:t>stale</w:t>
+            </w:r>
+          </w:p>
+        </w:tc>
+        <w:tc>
+          <w:tcPr>
+            <w:tcW w:type="dxa" w:w="2160"/>
+          </w:tcPr>
+          <w:p>
+            <w:r>
+              <w:rPr>
+                <w:sz w:val="17"/>
+              </w:rPr>
+              <w:t>11 Reply to John Hart - Follow-up Questions DRAFT.docx</w:t>
             </w:r>
           </w:p>
         </w:tc>
@@ -1507,6 +1560,59 @@
               <w:rPr>
                 <w:sz w:val="17"/>
               </w:rPr>
+              <w:t>11 Reply to John Hart - Follow-up Questions DRAFT.docx</w:t>
+            </w:r>
+          </w:p>
+        </w:tc>
+        <w:tc>
+          <w:tcPr>
+            <w:tcW w:type="dxa" w:w="2160"/>
+          </w:tcPr>
+          <w:p>
+            <w:r>
+              <w:rPr>
+                <w:sz w:val="17"/>
+              </w:rPr>
+              <w:t>PASS</w:t>
+            </w:r>
+          </w:p>
+        </w:tc>
+        <w:tc>
+          <w:tcPr>
+            <w:tcW w:type="dxa" w:w="2160"/>
+          </w:tcPr>
+          <w:p>
+            <w:r>
+              <w:rPr>
+                <w:sz w:val="17"/>
+              </w:rPr>
+            </w:r>
+          </w:p>
+        </w:tc>
+      </w:tr>
+      <w:tr>
+        <w:tc>
+          <w:tcPr>
+            <w:tcW w:type="dxa" w:w="2160"/>
+          </w:tcPr>
+          <w:p>
+            <w:r>
+              <w:rPr>
+                <w:sz w:val="17"/>
+              </w:rPr>
+              <w:t>format</w:t>
+            </w:r>
+          </w:p>
+        </w:tc>
+        <w:tc>
+          <w:tcPr>
+            <w:tcW w:type="dxa" w:w="2160"/>
+          </w:tcPr>
+          <w:p>
+            <w:r>
+              <w:rPr>
+                <w:sz w:val="17"/>
+              </w:rPr>
               <w:t>4 Business Plan ADDENDUM Refuge.docx</w:t>
             </w:r>
           </w:p>

</xml_diff>

<commit_message>
Fix PTAN and reactivation-letter date across the package
The official Palmetto GBA reactivation letter and CMS confirmation
email (both dated 3/20/2026) show CCN/PTAN A91679 - every document in
the package had it truncated to A9167 (missing the trailing 9), and
several had the reactivation letter misdated 3/23/2026. Fixed in the
valuation package generator (rebuilt), the master tracker, the file
index, and the transition/operating plans.

Also corrected three files that rounded the verified final payment to
$258,489 instead of the exact $258,489.46, and fixed the underlying
bug that let that slip through: qa_package.py's stale-value blacklist
had "$258,489" as a plain substring, which would always false-flag the
correct $258,489.46 figure too. Replaced with a regex guard, added the
matching one for the bad PTAN, and expanded the stale-value scan to
cover the valuation and transition-plan folders, which weren't
checked before.
</commit_message>
<xml_diff>
--- a/sba_application/13_checklist_response_2026-07-16/AUDIT REPORT.docx
+++ b/sba_application/13_checklist_response_2026-07-16/AUDIT REPORT.docx
@@ -25,7 +25,7 @@
         <w:rPr>
           <w:b/>
         </w:rPr>
-        <w:t>RESULT: 43 of 43 checks passed.</w:t>
+        <w:t>RESULT: 47 of 47 checks passed.</w:t>
       </w:r>
     </w:p>
     <w:p>
@@ -1084,6 +1084,218 @@
                 <w:sz w:val="17"/>
               </w:rPr>
               <w:t>Reply Email Todd Plummer DRAFT.docx</w:t>
+            </w:r>
+          </w:p>
+        </w:tc>
+        <w:tc>
+          <w:tcPr>
+            <w:tcW w:type="dxa" w:w="2160"/>
+          </w:tcPr>
+          <w:p>
+            <w:r>
+              <w:rPr>
+                <w:sz w:val="17"/>
+              </w:rPr>
+              <w:t>PASS</w:t>
+            </w:r>
+          </w:p>
+        </w:tc>
+        <w:tc>
+          <w:tcPr>
+            <w:tcW w:type="dxa" w:w="2160"/>
+          </w:tcPr>
+          <w:p>
+            <w:r>
+              <w:rPr>
+                <w:sz w:val="17"/>
+              </w:rPr>
+            </w:r>
+          </w:p>
+        </w:tc>
+      </w:tr>
+      <w:tr>
+        <w:tc>
+          <w:tcPr>
+            <w:tcW w:type="dxa" w:w="2160"/>
+          </w:tcPr>
+          <w:p>
+            <w:r>
+              <w:rPr>
+                <w:sz w:val="17"/>
+              </w:rPr>
+              <w:t>stale</w:t>
+            </w:r>
+          </w:p>
+        </w:tc>
+        <w:tc>
+          <w:tcPr>
+            <w:tcW w:type="dxa" w:w="2160"/>
+          </w:tcPr>
+          <w:p>
+            <w:r>
+              <w:rPr>
+                <w:sz w:val="17"/>
+              </w:rPr>
+              <w:t>Email to William - Preliminary Valuation Info DRAFT.docx</w:t>
+            </w:r>
+          </w:p>
+        </w:tc>
+        <w:tc>
+          <w:tcPr>
+            <w:tcW w:type="dxa" w:w="2160"/>
+          </w:tcPr>
+          <w:p>
+            <w:r>
+              <w:rPr>
+                <w:sz w:val="17"/>
+              </w:rPr>
+              <w:t>PASS</w:t>
+            </w:r>
+          </w:p>
+        </w:tc>
+        <w:tc>
+          <w:tcPr>
+            <w:tcW w:type="dxa" w:w="2160"/>
+          </w:tcPr>
+          <w:p>
+            <w:r>
+              <w:rPr>
+                <w:sz w:val="17"/>
+              </w:rPr>
+            </w:r>
+          </w:p>
+        </w:tc>
+      </w:tr>
+      <w:tr>
+        <w:tc>
+          <w:tcPr>
+            <w:tcW w:type="dxa" w:w="2160"/>
+          </w:tcPr>
+          <w:p>
+            <w:r>
+              <w:rPr>
+                <w:sz w:val="17"/>
+              </w:rPr>
+              <w:t>stale</w:t>
+            </w:r>
+          </w:p>
+        </w:tc>
+        <w:tc>
+          <w:tcPr>
+            <w:tcW w:type="dxa" w:w="2160"/>
+          </w:tcPr>
+          <w:p>
+            <w:r>
+              <w:rPr>
+                <w:sz w:val="17"/>
+              </w:rPr>
+              <w:t>Refuge Hospice - Preliminary Information for FMV Evaluation.docx</w:t>
+            </w:r>
+          </w:p>
+        </w:tc>
+        <w:tc>
+          <w:tcPr>
+            <w:tcW w:type="dxa" w:w="2160"/>
+          </w:tcPr>
+          <w:p>
+            <w:r>
+              <w:rPr>
+                <w:sz w:val="17"/>
+              </w:rPr>
+              <w:t>PASS</w:t>
+            </w:r>
+          </w:p>
+        </w:tc>
+        <w:tc>
+          <w:tcPr>
+            <w:tcW w:type="dxa" w:w="2160"/>
+          </w:tcPr>
+          <w:p>
+            <w:r>
+              <w:rPr>
+                <w:sz w:val="17"/>
+              </w:rPr>
+            </w:r>
+          </w:p>
+        </w:tc>
+      </w:tr>
+      <w:tr>
+        <w:tc>
+          <w:tcPr>
+            <w:tcW w:type="dxa" w:w="2160"/>
+          </w:tcPr>
+          <w:p>
+            <w:r>
+              <w:rPr>
+                <w:sz w:val="17"/>
+              </w:rPr>
+              <w:t>stale</w:t>
+            </w:r>
+          </w:p>
+        </w:tc>
+        <w:tc>
+          <w:tcPr>
+            <w:tcW w:type="dxa" w:w="2160"/>
+          </w:tcPr>
+          <w:p>
+            <w:r>
+              <w:rPr>
+                <w:sz w:val="17"/>
+              </w:rPr>
+              <w:t>REFUGE_TRANSITION_PLAN.md</w:t>
+            </w:r>
+          </w:p>
+        </w:tc>
+        <w:tc>
+          <w:tcPr>
+            <w:tcW w:type="dxa" w:w="2160"/>
+          </w:tcPr>
+          <w:p>
+            <w:r>
+              <w:rPr>
+                <w:sz w:val="17"/>
+              </w:rPr>
+              <w:t>PASS</w:t>
+            </w:r>
+          </w:p>
+        </w:tc>
+        <w:tc>
+          <w:tcPr>
+            <w:tcW w:type="dxa" w:w="2160"/>
+          </w:tcPr>
+          <w:p>
+            <w:r>
+              <w:rPr>
+                <w:sz w:val="17"/>
+              </w:rPr>
+            </w:r>
+          </w:p>
+        </w:tc>
+      </w:tr>
+      <w:tr>
+        <w:tc>
+          <w:tcPr>
+            <w:tcW w:type="dxa" w:w="2160"/>
+          </w:tcPr>
+          <w:p>
+            <w:r>
+              <w:rPr>
+                <w:sz w:val="17"/>
+              </w:rPr>
+              <w:t>stale</w:t>
+            </w:r>
+          </w:p>
+        </w:tc>
+        <w:tc>
+          <w:tcPr>
+            <w:tcW w:type="dxa" w:w="2160"/>
+          </w:tcPr>
+          <w:p>
+            <w:r>
+              <w:rPr>
+                <w:sz w:val="17"/>
+              </w:rPr>
+              <w:t>refuge-operating-plan.md</w:t>
             </w:r>
           </w:p>
         </w:tc>

</xml_diff>